<commit_message>
Add SIMC and SIAC to Servicios Empresariales; update SEO keywords and manual
Co-Authored-By: Claude Opus 5.5 <noreply@anthropic.com>
Claude-Session: https://claude.ai/code/session_01MDdXgMpX7i1guBDSiddehG
</commit_message>
<xml_diff>
--- a/consein-soluciones/Consein_Manual_SEO_Soluciones.docx
+++ b/consein-soluciones/Consein_Manual_SEO_Soluciones.docx
@@ -54,7 +54,7 @@
         <w:rPr>
           <w:color w:val="5E6474"/>
         </w:rPr>
-        <w:t xml:space="preserve">Versión 1.0 · Octubre 2026 · Documento editable</w:t>
+        <w:t xml:space="preserve">Versión 1.1 · Octubre 2026 · Documento editable</w:t>
       </w:r>
     </w:p>
     <w:p>
@@ -858,6 +858,124 @@
                 <w:szCs w:val="19"/>
               </w:rPr>
               <w:t xml:space="preserve">Title y H1 orientados a «programa de adopción de IA».</w:t>
+            </w:r>
+          </w:p>
+        </w:tc>
+      </w:tr>
+      <w:tr>
+        <w:tc>
+          <w:tcPr>
+            <w:tcW w:type="dxa" w:w="2700"/>
+            <w:tcBorders>
+              <w:top w:val="single" w:color="D9DCE3" w:sz="4"/>
+              <w:left w:val="single" w:color="D9DCE3" w:sz="4"/>
+              <w:bottom w:val="single" w:color="D9DCE3" w:sz="4"/>
+              <w:right w:val="single" w:color="D9DCE3" w:sz="4"/>
+            </w:tcBorders>
+            <w:tcMar>
+              <w:top w:type="dxa" w:w="70"/>
+              <w:left w:type="dxa" w:w="110"/>
+              <w:bottom w:type="dxa" w:w="70"/>
+              <w:right w:type="dxa" w:w="110"/>
+            </w:tcMar>
+          </w:tcPr>
+          <w:p>
+            <w:r>
+              <w:rPr>
+                <w:b w:val="false"/>
+                <w:bCs w:val="false"/>
+                <w:sz w:val="19"/>
+                <w:szCs w:val="19"/>
+              </w:rPr>
+              <w:t xml:space="preserve">Servicios Empresariales</w:t>
+            </w:r>
+          </w:p>
+        </w:tc>
+        <w:tc>
+          <w:tcPr>
+            <w:tcW w:type="dxa" w:w="6660"/>
+            <w:tcBorders>
+              <w:top w:val="single" w:color="D9DCE3" w:sz="4"/>
+              <w:left w:val="single" w:color="D9DCE3" w:sz="4"/>
+              <w:bottom w:val="single" w:color="D9DCE3" w:sz="4"/>
+              <w:right w:val="single" w:color="D9DCE3" w:sz="4"/>
+            </w:tcBorders>
+            <w:tcMar>
+              <w:top w:type="dxa" w:w="70"/>
+              <w:left w:type="dxa" w:w="110"/>
+              <w:bottom w:type="dxa" w:w="70"/>
+              <w:right w:type="dxa" w:w="110"/>
+            </w:tcMar>
+          </w:tcPr>
+          <w:p>
+            <w:r>
+              <w:rPr>
+                <w:b w:val="false"/>
+                <w:bCs w:val="false"/>
+                <w:sz w:val="19"/>
+                <w:szCs w:val="19"/>
+              </w:rPr>
+              <w:t xml:space="preserve">Incorporamos SIMC (Sistema Integrado de Mercado de Capitales) y SIAC (Sistema Integrado de Accionistas) como línea «Mercado de capitales y gobierno corporativo», con meta, H2, FAQ, datos estructurados y palabras clave para casas de bolsa, emisores y registro de accionistas.</w:t>
+            </w:r>
+          </w:p>
+        </w:tc>
+      </w:tr>
+      <w:tr>
+        <w:tc>
+          <w:tcPr>
+            <w:tcW w:type="dxa" w:w="2700"/>
+            <w:tcBorders>
+              <w:top w:val="single" w:color="D9DCE3" w:sz="4"/>
+              <w:left w:val="single" w:color="D9DCE3" w:sz="4"/>
+              <w:bottom w:val="single" w:color="D9DCE3" w:sz="4"/>
+              <w:right w:val="single" w:color="D9DCE3" w:sz="4"/>
+            </w:tcBorders>
+            <w:shd w:fill="F7F8FA" w:color="auto" w:val="clear"/>
+            <w:tcMar>
+              <w:top w:type="dxa" w:w="70"/>
+              <w:left w:type="dxa" w:w="110"/>
+              <w:bottom w:type="dxa" w:w="70"/>
+              <w:right w:type="dxa" w:w="110"/>
+            </w:tcMar>
+          </w:tcPr>
+          <w:p>
+            <w:r>
+              <w:rPr>
+                <w:b w:val="false"/>
+                <w:bCs w:val="false"/>
+                <w:sz w:val="19"/>
+                <w:szCs w:val="19"/>
+              </w:rPr>
+              <w:t xml:space="preserve">Sello WITSA</w:t>
+            </w:r>
+          </w:p>
+        </w:tc>
+        <w:tc>
+          <w:tcPr>
+            <w:tcW w:type="dxa" w:w="6660"/>
+            <w:tcBorders>
+              <w:top w:val="single" w:color="D9DCE3" w:sz="4"/>
+              <w:left w:val="single" w:color="D9DCE3" w:sz="4"/>
+              <w:bottom w:val="single" w:color="D9DCE3" w:sz="4"/>
+              <w:right w:val="single" w:color="D9DCE3" w:sz="4"/>
+            </w:tcBorders>
+            <w:shd w:fill="F7F8FA" w:color="auto" w:val="clear"/>
+            <w:tcMar>
+              <w:top w:type="dxa" w:w="70"/>
+              <w:left w:type="dxa" w:w="110"/>
+              <w:bottom w:type="dxa" w:w="70"/>
+              <w:right w:type="dxa" w:w="110"/>
+            </w:tcMar>
+          </w:tcPr>
+          <w:p>
+            <w:r>
+              <w:rPr>
+                <w:b w:val="false"/>
+                <w:bCs w:val="false"/>
+                <w:sz w:val="19"/>
+                <w:szCs w:val="19"/>
+              </w:rPr>
+              <w:t xml:space="preserve">Sello del WITSA Global AI Award for Infrastructure en BanIA, con texto alternativo y el premio en el dato estructurado Organization.</w:t>
             </w:r>
           </w:p>
         </w:tc>
@@ -4874,6 +4992,19 @@
         <w:spacing w:after="80"/>
       </w:pPr>
       <w:r>
+        <w:t xml:space="preserve">SIMC y SIAC pueden tener página propia (/soluciones/dynamics-365-erp-crm/simc y /siac) con el enlace de acceso de clientes, porque concentran búsquedas de marca y de nicho con baja competencia.</w:t>
+      </w:r>
+    </w:p>
+    <w:p>
+      <w:pPr>
+        <w:pStyle w:val="ListParagraph"/>
+        <w:numPr>
+          <w:ilvl w:val="0"/>
+          <w:numId w:val="2"/>
+        </w:numPr>
+        <w:spacing w:after="80"/>
+      </w:pPr>
+      <w:r>
         <w:t xml:space="preserve">Completar en Organization: logo (URL pública), sameAs (LinkedIn, YouTube, Instagram oficiales), dirección y teléfono por país (LocalBusiness).</w:t>
       </w:r>
     </w:p>
@@ -5467,6 +5598,65 @@
                 <w:sz w:val="19"/>
                 <w:szCs w:val="19"/>
               </w:rPr>
+              <w:t xml:space="preserve">Sector financiero</w:t>
+            </w:r>
+          </w:p>
+        </w:tc>
+        <w:tc>
+          <w:tcPr>
+            <w:tcW w:type="dxa" w:w="6360"/>
+            <w:tcBorders>
+              <w:top w:val="single" w:color="D9DCE3" w:sz="4"/>
+              <w:left w:val="single" w:color="D9DCE3" w:sz="4"/>
+              <w:bottom w:val="single" w:color="D9DCE3" w:sz="4"/>
+              <w:right w:val="single" w:color="D9DCE3" w:sz="4"/>
+            </w:tcBorders>
+            <w:tcMar>
+              <w:top w:type="dxa" w:w="70"/>
+              <w:left w:type="dxa" w:w="110"/>
+              <w:bottom w:type="dxa" w:w="70"/>
+              <w:right w:type="dxa" w:w="110"/>
+            </w:tcMar>
+          </w:tcPr>
+          <w:p>
+            <w:r>
+              <w:rPr>
+                <w:b w:val="false"/>
+                <w:bCs w:val="false"/>
+                <w:sz w:val="19"/>
+                <w:szCs w:val="19"/>
+              </w:rPr>
+              <w:t xml:space="preserve">Presencia de SIMC y SIAC en directorios y eventos de bolsas de valores, cajas de valores y asociaciones de emisores; casos de clientes del mercado de capitales.</w:t>
+            </w:r>
+          </w:p>
+        </w:tc>
+      </w:tr>
+      <w:tr>
+        <w:tc>
+          <w:tcPr>
+            <w:tcW w:type="dxa" w:w="3000"/>
+            <w:tcBorders>
+              <w:top w:val="single" w:color="D9DCE3" w:sz="4"/>
+              <w:left w:val="single" w:color="D9DCE3" w:sz="4"/>
+              <w:bottom w:val="single" w:color="D9DCE3" w:sz="4"/>
+              <w:right w:val="single" w:color="D9DCE3" w:sz="4"/>
+            </w:tcBorders>
+            <w:shd w:fill="F7F8FA" w:color="auto" w:val="clear"/>
+            <w:tcMar>
+              <w:top w:type="dxa" w:w="70"/>
+              <w:left w:type="dxa" w:w="110"/>
+              <w:bottom w:type="dxa" w:w="70"/>
+              <w:right w:type="dxa" w:w="110"/>
+            </w:tcMar>
+          </w:tcPr>
+          <w:p>
+            <w:r>
+              <w:rPr>
+                <w:b w:val="false"/>
+                <w:bCs w:val="false"/>
+                <w:sz w:val="19"/>
+                <w:szCs w:val="19"/>
+              </w:rPr>
               <w:t xml:space="preserve">Alianzas</w:t>
             </w:r>
           </w:p>
@@ -5480,6 +5670,7 @@
               <w:bottom w:val="single" w:color="D9DCE3" w:sz="4"/>
               <w:right w:val="single" w:color="D9DCE3" w:sz="4"/>
             </w:tcBorders>
+            <w:shd w:fill="F7F8FA" w:color="auto" w:val="clear"/>
             <w:tcMar>
               <w:top w:type="dxa" w:w="70"/>
               <w:left w:type="dxa" w:w="110"/>
@@ -6209,7 +6400,7 @@
                 <w:sz w:val="19"/>
                 <w:szCs w:val="19"/>
               </w:rPr>
-              <w:t xml:space="preserve">7–8</w:t>
+              <w:t xml:space="preserve">5–6</w:t>
             </w:r>
           </w:p>
         </w:tc>
@@ -6237,7 +6428,7 @@
                 <w:sz w:val="19"/>
                 <w:szCs w:val="19"/>
               </w:rPr>
-              <w:t xml:space="preserve">Automatizar facturas con IA: guía práctica</w:t>
+              <w:t xml:space="preserve">Registro de accionistas digital: del libro en papel a la trazabilidad total</w:t>
             </w:r>
           </w:p>
         </w:tc>
@@ -6265,7 +6456,7 @@
                 <w:sz w:val="19"/>
                 <w:szCs w:val="19"/>
               </w:rPr>
-              <w:t xml:space="preserve">Automatización</w:t>
+              <w:t xml:space="preserve">Servicios Empresariales (SIAC)</w:t>
             </w:r>
           </w:p>
         </w:tc>
@@ -6325,7 +6516,7 @@
                 <w:sz w:val="19"/>
                 <w:szCs w:val="19"/>
               </w:rPr>
-              <w:t xml:space="preserve">Cómo medir la madurez de su empresa en IA</w:t>
+              <w:t xml:space="preserve">Automatizar facturas con IA: guía práctica</w:t>
             </w:r>
           </w:p>
         </w:tc>
@@ -6354,7 +6545,7 @@
                 <w:sz w:val="19"/>
                 <w:szCs w:val="19"/>
               </w:rPr>
-              <w:t xml:space="preserve">NortIA</w:t>
+              <w:t xml:space="preserve">Automatización</w:t>
             </w:r>
           </w:p>
         </w:tc>
@@ -6384,7 +6575,7 @@
                 <w:sz w:val="19"/>
                 <w:szCs w:val="19"/>
               </w:rPr>
-              <w:t xml:space="preserve">9–10</w:t>
+              <w:t xml:space="preserve">7–8</w:t>
             </w:r>
           </w:p>
         </w:tc>
@@ -6412,7 +6603,7 @@
                 <w:sz w:val="19"/>
                 <w:szCs w:val="19"/>
               </w:rPr>
-              <w:t xml:space="preserve">Del piloto a producción: cómo escalar agentes de IA</w:t>
+              <w:t xml:space="preserve">Cómo medir la madurez de su empresa en IA</w:t>
             </w:r>
           </w:p>
         </w:tc>
@@ -6440,7 +6631,7 @@
                 <w:sz w:val="19"/>
                 <w:szCs w:val="19"/>
               </w:rPr>
-              <w:t xml:space="preserve">Inteligencia artificial</w:t>
+              <w:t xml:space="preserve">NortIA</w:t>
             </w:r>
           </w:p>
         </w:tc>
@@ -6500,7 +6691,7 @@
                 <w:sz w:val="19"/>
                 <w:szCs w:val="19"/>
               </w:rPr>
-              <w:t xml:space="preserve">Cómo preparar sus datos para la inteligencia artificial</w:t>
+              <w:t xml:space="preserve">Del piloto a producción: cómo escalar agentes de IA</w:t>
             </w:r>
           </w:p>
         </w:tc>
@@ -6529,7 +6720,7 @@
                 <w:sz w:val="19"/>
                 <w:szCs w:val="19"/>
               </w:rPr>
-              <w:t xml:space="preserve">Datos</w:t>
+              <w:t xml:space="preserve">Inteligencia artificial</w:t>
             </w:r>
           </w:p>
         </w:tc>
@@ -6559,7 +6750,7 @@
                 <w:sz w:val="19"/>
                 <w:szCs w:val="19"/>
               </w:rPr>
-              <w:t xml:space="preserve">11–12</w:t>
+              <w:t xml:space="preserve">9–10</w:t>
             </w:r>
           </w:p>
         </w:tc>
@@ -6587,7 +6778,7 @@
                 <w:sz w:val="19"/>
                 <w:szCs w:val="19"/>
               </w:rPr>
-              <w:t xml:space="preserve">Zero Trust explicado para directivos</w:t>
+              <w:t xml:space="preserve">Cómo preparar sus datos para la inteligencia artificial</w:t>
             </w:r>
           </w:p>
         </w:tc>
@@ -6615,7 +6806,7 @@
                 <w:sz w:val="19"/>
                 <w:szCs w:val="19"/>
               </w:rPr>
-              <w:t xml:space="preserve">Ciberseguridad</w:t>
+              <w:t xml:space="preserve">Datos</w:t>
             </w:r>
           </w:p>
         </w:tc>
@@ -6675,6 +6866,93 @@
                 <w:sz w:val="19"/>
                 <w:szCs w:val="19"/>
               </w:rPr>
+              <w:t xml:space="preserve">Zero Trust explicado para directivos</w:t>
+            </w:r>
+          </w:p>
+        </w:tc>
+        <w:tc>
+          <w:tcPr>
+            <w:tcW w:type="dxa" w:w="3660"/>
+            <w:tcBorders>
+              <w:top w:val="single" w:color="D9DCE3" w:sz="4"/>
+              <w:left w:val="single" w:color="D9DCE3" w:sz="4"/>
+              <w:bottom w:val="single" w:color="D9DCE3" w:sz="4"/>
+              <w:right w:val="single" w:color="D9DCE3" w:sz="4"/>
+            </w:tcBorders>
+            <w:shd w:fill="F7F8FA" w:color="auto" w:val="clear"/>
+            <w:tcMar>
+              <w:top w:type="dxa" w:w="70"/>
+              <w:left w:type="dxa" w:w="110"/>
+              <w:bottom w:type="dxa" w:w="70"/>
+              <w:right w:type="dxa" w:w="110"/>
+            </w:tcMar>
+          </w:tcPr>
+          <w:p>
+            <w:r>
+              <w:rPr>
+                <w:b w:val="false"/>
+                <w:bCs w:val="false"/>
+                <w:sz w:val="19"/>
+                <w:szCs w:val="19"/>
+              </w:rPr>
+              <w:t xml:space="preserve">Ciberseguridad</w:t>
+            </w:r>
+          </w:p>
+        </w:tc>
+      </w:tr>
+      <w:tr>
+        <w:tc>
+          <w:tcPr>
+            <w:tcW w:type="dxa" w:w="1500"/>
+            <w:tcBorders>
+              <w:top w:val="single" w:color="D9DCE3" w:sz="4"/>
+              <w:left w:val="single" w:color="D9DCE3" w:sz="4"/>
+              <w:bottom w:val="single" w:color="D9DCE3" w:sz="4"/>
+              <w:right w:val="single" w:color="D9DCE3" w:sz="4"/>
+            </w:tcBorders>
+            <w:tcMar>
+              <w:top w:type="dxa" w:w="70"/>
+              <w:left w:type="dxa" w:w="110"/>
+              <w:bottom w:type="dxa" w:w="70"/>
+              <w:right w:type="dxa" w:w="110"/>
+            </w:tcMar>
+          </w:tcPr>
+          <w:p>
+            <w:r>
+              <w:rPr>
+                <w:b w:val="false"/>
+                <w:bCs w:val="false"/>
+                <w:sz w:val="19"/>
+                <w:szCs w:val="19"/>
+              </w:rPr>
+              <w:t xml:space="preserve">11–12</w:t>
+            </w:r>
+          </w:p>
+        </w:tc>
+        <w:tc>
+          <w:tcPr>
+            <w:tcW w:type="dxa" w:w="4200"/>
+            <w:tcBorders>
+              <w:top w:val="single" w:color="D9DCE3" w:sz="4"/>
+              <w:left w:val="single" w:color="D9DCE3" w:sz="4"/>
+              <w:bottom w:val="single" w:color="D9DCE3" w:sz="4"/>
+              <w:right w:val="single" w:color="D9DCE3" w:sz="4"/>
+            </w:tcBorders>
+            <w:tcMar>
+              <w:top w:type="dxa" w:w="70"/>
+              <w:left w:type="dxa" w:w="110"/>
+              <w:bottom w:type="dxa" w:w="70"/>
+              <w:right w:type="dxa" w:w="110"/>
+            </w:tcMar>
+          </w:tcPr>
+          <w:p>
+            <w:r>
+              <w:rPr>
+                <w:b w:val="false"/>
+                <w:bCs w:val="false"/>
+                <w:sz w:val="19"/>
+                <w:szCs w:val="19"/>
+              </w:rPr>
               <w:t xml:space="preserve">Revisión de resultados y actualización de páginas</w:t>
             </w:r>
           </w:p>
@@ -6688,7 +6966,6 @@
               <w:bottom w:val="single" w:color="D9DCE3" w:sz="4"/>
               <w:right w:val="single" w:color="D9DCE3" w:sz="4"/>
             </w:tcBorders>
-            <w:shd w:fill="F7F8FA" w:color="auto" w:val="clear"/>
             <w:tcMar>
               <w:top w:type="dxa" w:w="70"/>
               <w:left w:type="dxa" w:w="110"/>

</xml_diff>

<commit_message>
Ciberseguridad: add Escudo Digital 360 for banking; update SEO docs
Co-Authored-By: Claude Opus 5.5 <noreply@anthropic.com>
Claude-Session: https://claude.ai/code/session_01MDdXgMpX7i1guBDSiddehG
</commit_message>
<xml_diff>
--- a/consein-soluciones/Consein_Manual_SEO_Soluciones.docx
+++ b/consein-soluciones/Consein_Manual_SEO_Soluciones.docx
@@ -946,6 +946,65 @@
                 <w:sz w:val="19"/>
                 <w:szCs w:val="19"/>
               </w:rPr>
+              <w:t xml:space="preserve">Ciberseguridad</w:t>
+            </w:r>
+          </w:p>
+        </w:tc>
+        <w:tc>
+          <w:tcPr>
+            <w:tcW w:type="dxa" w:w="6660"/>
+            <w:tcBorders>
+              <w:top w:val="single" w:color="D9DCE3" w:sz="4"/>
+              <w:left w:val="single" w:color="D9DCE3" w:sz="4"/>
+              <w:bottom w:val="single" w:color="D9DCE3" w:sz="4"/>
+              <w:right w:val="single" w:color="D9DCE3" w:sz="4"/>
+            </w:tcBorders>
+            <w:shd w:fill="F7F8FA" w:color="auto" w:val="clear"/>
+            <w:tcMar>
+              <w:top w:type="dxa" w:w="70"/>
+              <w:left w:type="dxa" w:w="110"/>
+              <w:bottom w:type="dxa" w:w="70"/>
+              <w:right w:type="dxa" w:w="110"/>
+            </w:tcMar>
+          </w:tcPr>
+          <w:p>
+            <w:r>
+              <w:rPr>
+                <w:b w:val="false"/>
+                <w:bCs w:val="false"/>
+                <w:sz w:val="19"/>
+                <w:szCs w:val="19"/>
+              </w:rPr>
+              <w:t xml:space="preserve">Nueva oferta Escudo Digital 360° para banca, con FAQ y palabras clave del sector financiero; Security Assessment 360 suma acompañamiento y seguimiento del Secure Score.</w:t>
+            </w:r>
+          </w:p>
+        </w:tc>
+      </w:tr>
+      <w:tr>
+        <w:tc>
+          <w:tcPr>
+            <w:tcW w:type="dxa" w:w="2700"/>
+            <w:tcBorders>
+              <w:top w:val="single" w:color="D9DCE3" w:sz="4"/>
+              <w:left w:val="single" w:color="D9DCE3" w:sz="4"/>
+              <w:bottom w:val="single" w:color="D9DCE3" w:sz="4"/>
+              <w:right w:val="single" w:color="D9DCE3" w:sz="4"/>
+            </w:tcBorders>
+            <w:tcMar>
+              <w:top w:type="dxa" w:w="70"/>
+              <w:left w:type="dxa" w:w="110"/>
+              <w:bottom w:type="dxa" w:w="70"/>
+              <w:right w:type="dxa" w:w="110"/>
+            </w:tcMar>
+          </w:tcPr>
+          <w:p>
+            <w:r>
+              <w:rPr>
+                <w:b w:val="false"/>
+                <w:bCs w:val="false"/>
+                <w:sz w:val="19"/>
+                <w:szCs w:val="19"/>
+              </w:rPr>
               <w:t xml:space="preserve">Sello WITSA</w:t>
             </w:r>
           </w:p>
@@ -959,7 +1018,6 @@
               <w:bottom w:val="single" w:color="D9DCE3" w:sz="4"/>
               <w:right w:val="single" w:color="D9DCE3" w:sz="4"/>
             </w:tcBorders>
-            <w:shd w:fill="F7F8FA" w:color="auto" w:val="clear"/>
             <w:tcMar>
               <w:top w:type="dxa" w:w="70"/>
               <w:left w:type="dxa" w:w="110"/>

</xml_diff>